<commit_message>
Update source docs (corrected Cert III F2F/VOF) as new standard; trim now-redundant adjustments
</commit_message>
<xml_diff>
--- a/source_docs/ICT30120 Cert III  General F2F OUR.docx
+++ b/source_docs/ICT30120 Cert III  General F2F OUR.docx
@@ -399,7 +399,6 @@
         <w:tc>
           <w:tcPr>
             <w:tcW w:w="1625" w:type="dxa"/>
-            <w:vMerge w:val="restart"/>
             <w:vAlign w:val="center"/>
           </w:tcPr>
           <w:p>
@@ -675,9 +674,29 @@
         <w:tc>
           <w:tcPr>
             <w:tcW w:w="1625" w:type="dxa"/>
-            <w:vMerge/>
+            <w:shd w:val="clear" w:color="auto" w:fill="C7E4DB" w:themeFill="accent3" w:themeFillTint="66"/>
             <w:vAlign w:val="center"/>
           </w:tcPr>
+          <w:p>
+            <w:pPr>
+              <w:ind w:firstLine="28"/>
+              <w:jc w:val="left"/>
+              <w:cnfStyle w:val="000000000000" w:firstRow="0" w:lastRow="0" w:firstColumn="0" w:lastColumn="0" w:oddVBand="0" w:evenVBand="0" w:oddHBand="0" w:evenHBand="0" w:firstRowFirstColumn="0" w:firstRowLastColumn="0" w:lastRowFirstColumn="0" w:lastRowLastColumn="0"/>
+              <w:rPr>
+                <w:rFonts w:asciiTheme="majorHAnsi" w:eastAsia="Times New Roman" w:hAnsiTheme="majorHAnsi" w:cstheme="majorBidi"/>
+                <w:color w:val="000000" w:themeColor="text1"/>
+                <w:lang w:val="en-AU" w:eastAsia="en-AU"/>
+              </w:rPr>
+            </w:pPr>
+            <w:r>
+              <w:rPr>
+                <w:rFonts w:asciiTheme="majorHAnsi" w:eastAsia="Times New Roman" w:hAnsiTheme="majorHAnsi" w:cstheme="majorBidi"/>
+                <w:color w:val="000000" w:themeColor="text1"/>
+                <w:lang w:val="en-AU" w:eastAsia="en-AU"/>
+              </w:rPr>
+              <w:t>Graham Barber</w:t>
+            </w:r>
+          </w:p>
           <w:p>
             <w:pPr>
               <w:ind w:firstLine="28"/>
@@ -808,14 +827,71 @@
                 <w:color w:val="000000" w:themeColor="text1"/>
               </w:rPr>
             </w:pPr>
+            <w:r>
+              <w:rPr>
+                <w:rFonts w:ascii="Calibri" w:eastAsia="Calibri" w:hAnsi="Calibri" w:cs="Calibri"/>
+                <w:color w:val="000000" w:themeColor="text1"/>
+              </w:rPr>
+              <w:t>21/07/2026</w:t>
+            </w:r>
+          </w:p>
+          <w:p>
+            <w:pPr>
+              <w:spacing w:line="240" w:lineRule="auto"/>
+              <w:ind w:firstLine="0"/>
+              <w:jc w:val="left"/>
+              <w:cnfStyle w:val="000000100000" w:firstRow="0" w:lastRow="0" w:firstColumn="0" w:lastColumn="0" w:oddVBand="0" w:evenVBand="0" w:oddHBand="1" w:evenHBand="0" w:firstRowFirstColumn="0" w:firstRowLastColumn="0" w:lastRowFirstColumn="0" w:lastRowLastColumn="0"/>
+              <w:rPr>
+                <w:rFonts w:ascii="Calibri" w:eastAsia="Calibri" w:hAnsi="Calibri" w:cs="Calibri"/>
+                <w:color w:val="000000" w:themeColor="text1"/>
+              </w:rPr>
+            </w:pPr>
+            <w:r>
+              <w:rPr>
+                <w:rFonts w:ascii="Calibri" w:eastAsia="Calibri" w:hAnsi="Calibri" w:cs="Calibri"/>
+                <w:color w:val="000000" w:themeColor="text1"/>
+              </w:rPr>
+              <w:t>01/12/2026</w:t>
+            </w:r>
+          </w:p>
+          <w:p>
+            <w:pPr>
+              <w:spacing w:line="240" w:lineRule="auto"/>
+              <w:ind w:firstLine="0"/>
+              <w:jc w:val="left"/>
+              <w:cnfStyle w:val="000000100000" w:firstRow="0" w:lastRow="0" w:firstColumn="0" w:lastColumn="0" w:oddVBand="0" w:evenVBand="0" w:oddHBand="1" w:evenHBand="0" w:firstRowFirstColumn="0" w:firstRowLastColumn="0" w:lastRowFirstColumn="0" w:lastRowLastColumn="0"/>
+              <w:rPr>
+                <w:rFonts w:ascii="Calibri" w:eastAsia="Calibri" w:hAnsi="Calibri" w:cs="Calibri"/>
+                <w:color w:val="000000" w:themeColor="text1"/>
+              </w:rPr>
+            </w:pPr>
           </w:p>
         </w:tc>
         <w:tc>
           <w:tcPr>
             <w:tcW w:w="1625" w:type="dxa"/>
-            <w:vMerge/>
             <w:vAlign w:val="center"/>
           </w:tcPr>
+          <w:p>
+            <w:pPr>
+              <w:ind w:firstLine="28"/>
+              <w:jc w:val="left"/>
+              <w:cnfStyle w:val="000000100000" w:firstRow="0" w:lastRow="0" w:firstColumn="0" w:lastColumn="0" w:oddVBand="0" w:evenVBand="0" w:oddHBand="1" w:evenHBand="0" w:firstRowFirstColumn="0" w:firstRowLastColumn="0" w:lastRowFirstColumn="0" w:lastRowLastColumn="0"/>
+              <w:rPr>
+                <w:rFonts w:asciiTheme="majorHAnsi" w:eastAsia="Times New Roman" w:hAnsiTheme="majorHAnsi" w:cstheme="majorBidi"/>
+                <w:color w:val="000000" w:themeColor="text1"/>
+                <w:lang w:val="en-AU" w:eastAsia="en-AU"/>
+              </w:rPr>
+            </w:pPr>
+            <w:r>
+              <w:rPr>
+                <w:rFonts w:asciiTheme="majorHAnsi" w:eastAsia="Times New Roman" w:hAnsiTheme="majorHAnsi" w:cstheme="majorBidi"/>
+                <w:color w:val="000000" w:themeColor="text1"/>
+                <w:lang w:val="en-AU" w:eastAsia="en-AU"/>
+              </w:rPr>
+              <w:t>Graham Barber</w:t>
+            </w:r>
+          </w:p>
           <w:p>
             <w:pPr>
               <w:ind w:firstLine="28"/>
@@ -1614,7 +1690,6 @@
         <w:tc>
           <w:tcPr>
             <w:tcW w:w="1625" w:type="dxa"/>
-            <w:vMerge w:val="restart"/>
             <w:vAlign w:val="center"/>
           </w:tcPr>
           <w:p>
@@ -1784,11 +1859,11 @@
         <w:tc>
           <w:tcPr>
             <w:tcW w:w="1625" w:type="dxa"/>
-            <w:vMerge/>
-          </w:tcPr>
-          <w:p>
-            <w:pPr>
-              <w:jc w:val="center"/>
+            <w:shd w:val="clear" w:color="auto" w:fill="C7E4DB" w:themeFill="accent3" w:themeFillTint="66"/>
+          </w:tcPr>
+          <w:p>
+            <w:pPr>
+              <w:ind w:firstLine="0"/>
               <w:cnfStyle w:val="000000000000" w:firstRow="0" w:lastRow="0" w:firstColumn="0" w:lastColumn="0" w:oddVBand="0" w:evenVBand="0" w:oddHBand="0" w:evenHBand="0" w:firstRowFirstColumn="0" w:firstRowLastColumn="0" w:lastRowFirstColumn="0" w:lastRowLastColumn="0"/>
               <w:rPr>
                 <w:rFonts w:asciiTheme="majorHAnsi" w:eastAsia="Times New Roman" w:hAnsiTheme="majorHAnsi" w:cstheme="majorHAnsi"/>
@@ -1796,6 +1871,14 @@
                 <w:lang w:val="en-AU" w:eastAsia="en-AU"/>
               </w:rPr>
             </w:pPr>
+            <w:r>
+              <w:rPr>
+                <w:rFonts w:asciiTheme="majorHAnsi" w:eastAsia="Times New Roman" w:hAnsiTheme="majorHAnsi" w:cstheme="majorHAnsi"/>
+                <w:color w:val="000000" w:themeColor="text1"/>
+                <w:lang w:val="en-AU" w:eastAsia="en-AU"/>
+              </w:rPr>
+              <w:t>Jennie Agustin</w:t>
+            </w:r>
           </w:p>
         </w:tc>
       </w:tr>
@@ -2031,7 +2114,7 @@
                   </a:ln>
                   <a:extLst>
                     <a:ext uri="{FAA26D3D-D897-4be2-8F04-BA451C77F1D7}">
-                      <ma14:placeholderFlag xmlns:a14="http://schemas.microsoft.com/office/drawing/2010/main" xmlns="" xmlns:mo="http://schemas.microsoft.com/office/mac/office/2008/main" xmlns:mv="urn:schemas-microsoft-com:mac:vml" xmlns:o="urn:schemas-microsoft-com:office:office" xmlns:v="urn:schemas-microsoft-com:vml" xmlns:w10="urn:schemas-microsoft-com:office:word" xmlns:w="http://schemas.openxmlformats.org/wordprocessingml/2006/main" xmlns:ma14="http://schemas.microsoft.com/office/mac/drawingml/2011/main" xmlns:arto="http://schemas.microsoft.com/office/word/2006/arto"/>
+                      <ma14:placeholderFlag xmlns:arto="http://schemas.microsoft.com/office/word/2006/arto" xmlns:ma14="http://schemas.microsoft.com/office/mac/drawingml/2011/main" xmlns:w="http://schemas.openxmlformats.org/wordprocessingml/2006/main" xmlns:w10="urn:schemas-microsoft-com:office:word" xmlns:v="urn:schemas-microsoft-com:vml" xmlns:o="urn:schemas-microsoft-com:office:office" xmlns:mv="urn:schemas-microsoft-com:mac:vml" xmlns:mo="http://schemas.microsoft.com/office/mac/office/2008/main" xmlns="" xmlns:a14="http://schemas.microsoft.com/office/drawing/2010/main"/>
                     </a:ext>
                   </a:extLst>
                 </pic:spPr>
@@ -4691,31 +4774,6 @@
 </file>
 
 <file path=customXml/item1.xml><?xml version="1.0" encoding="utf-8"?>
-<?mso-contentType ?>
-<spe:Receivers xmlns:spe="http://schemas.microsoft.com/sharepoint/events"/>
-</file>
-
-<file path=customXml/item2.xml><?xml version="1.0" encoding="utf-8"?>
-<?mso-contentType ?>
-<FormTemplates xmlns="http://schemas.microsoft.com/sharepoint/v3/contenttype/forms">
-  <Display>DocumentLibraryForm</Display>
-  <Edit>DocumentLibraryForm</Edit>
-  <New>DocumentLibraryForm</New>
-</FormTemplates>
-</file>
-
-<file path=customXml/item3.xml><?xml version="1.0" encoding="utf-8"?>
-<p:properties xmlns:p="http://schemas.microsoft.com/office/2006/metadata/properties" xmlns:xsi="http://www.w3.org/2001/XMLSchema-instance">
-  <documentManagement>
-    <TaxCatchAll xmlns="363f131b-4af0-4a66-9de1-3f50ca42dcc1" xsi:nil="true"/>
-    <lcf76f155ced4ddcb4097134ff3c332f xmlns="1e774ceb-dd0d-4965-bc86-3e314450e135">
-      <Terms xmlns="http://schemas.microsoft.com/office/infopath/2007/PartnerControls"/>
-    </lcf76f155ced4ddcb4097134ff3c332f>
-  </documentManagement>
-</p:properties>
-</file>
-
-<file path=customXml/item4.xml><?xml version="1.0" encoding="utf-8"?>
 <ct:contentTypeSchema xmlns:ct="http://schemas.microsoft.com/office/2006/metadata/contentType" xmlns:ma="http://schemas.microsoft.com/office/2006/metadata/properties/metaAttributes" ct:_="" ma:_="" ma:contentTypeName="Document" ma:contentTypeID="0x0101005FF42C543BBD7849899095302BC0167D" ma:contentTypeVersion="10" ma:contentTypeDescription="Create a new document." ma:contentTypeScope="" ma:versionID="739b271cbe682c22b1afe798abde8ec2">
   <xsd:schema xmlns:xsd="http://www.w3.org/2001/XMLSchema" xmlns:xs="http://www.w3.org/2001/XMLSchema" xmlns:p="http://schemas.microsoft.com/office/2006/metadata/properties" xmlns:ns2="5f9a2178-9cef-471f-be08-1d13262a2f1b" xmlns:ns3="1e774ceb-dd0d-4965-bc86-3e314450e135" xmlns:ns4="363f131b-4af0-4a66-9de1-3f50ca42dcc1" targetNamespace="http://schemas.microsoft.com/office/2006/metadata/properties" ma:root="true" ma:fieldsID="be080bbebe29b87a29aeaa3fc5f138d1" ns2:_="" ns3:_="" ns4:_="">
     <xsd:import namespace="5f9a2178-9cef-471f-be08-1d13262a2f1b"/>
@@ -4934,7 +4992,71 @@
 </ct:contentTypeSchema>
 </file>
 
+<file path=customXml/item2.xml><?xml version="1.0" encoding="utf-8"?>
+<p:properties xmlns:p="http://schemas.microsoft.com/office/2006/metadata/properties" xmlns:xsi="http://www.w3.org/2001/XMLSchema-instance">
+  <documentManagement>
+    <TaxCatchAll xmlns="363f131b-4af0-4a66-9de1-3f50ca42dcc1" xsi:nil="true"/>
+    <lcf76f155ced4ddcb4097134ff3c332f xmlns="1e774ceb-dd0d-4965-bc86-3e314450e135">
+      <Terms xmlns="http://schemas.microsoft.com/office/infopath/2007/PartnerControls"/>
+    </lcf76f155ced4ddcb4097134ff3c332f>
+  </documentManagement>
+</p:properties>
+</file>
+
+<file path=customXml/item3.xml><?xml version="1.0" encoding="utf-8"?>
+<?mso-contentType ?>
+<FormTemplates xmlns="http://schemas.microsoft.com/sharepoint/v3/contenttype/forms">
+  <Display>DocumentLibraryForm</Display>
+  <Edit>DocumentLibraryForm</Edit>
+  <New>DocumentLibraryForm</New>
+</FormTemplates>
+</file>
+
+<file path=customXml/item4.xml><?xml version="1.0" encoding="utf-8"?>
+<?mso-contentType ?>
+<spe:Receivers xmlns:spe="http://schemas.microsoft.com/sharepoint/events"/>
+</file>
+
 <file path=customXml/itemProps1.xml><?xml version="1.0" encoding="utf-8"?>
+<ds:datastoreItem xmlns:ds="http://schemas.openxmlformats.org/officeDocument/2006/customXml" ds:itemID="{E6399034-5E0E-4859-B1BF-AEAF2135B405}">
+  <ds:schemaRefs>
+    <ds:schemaRef ds:uri="http://schemas.microsoft.com/office/2006/metadata/contentType"/>
+    <ds:schemaRef ds:uri="http://schemas.microsoft.com/office/2006/metadata/properties/metaAttributes"/>
+    <ds:schemaRef ds:uri="http://www.w3.org/2001/XMLSchema"/>
+    <ds:schemaRef ds:uri="http://schemas.microsoft.com/office/2006/metadata/properties"/>
+    <ds:schemaRef ds:uri="5f9a2178-9cef-471f-be08-1d13262a2f1b"/>
+    <ds:schemaRef ds:uri="1e774ceb-dd0d-4965-bc86-3e314450e135"/>
+    <ds:schemaRef ds:uri="363f131b-4af0-4a66-9de1-3f50ca42dcc1"/>
+    <ds:schemaRef ds:uri="http://schemas.microsoft.com/office/2006/documentManagement/types"/>
+    <ds:schemaRef ds:uri="http://schemas.microsoft.com/office/infopath/2007/PartnerControls"/>
+    <ds:schemaRef ds:uri="http://schemas.openxmlformats.org/package/2006/metadata/core-properties"/>
+    <ds:schemaRef ds:uri="http://purl.org/dc/elements/1.1/"/>
+    <ds:schemaRef ds:uri="http://purl.org/dc/terms/"/>
+    <ds:schemaRef ds:uri="http://schemas.microsoft.com/internal/obd"/>
+  </ds:schemaRefs>
+</ds:datastoreItem>
+</file>
+
+<file path=customXml/itemProps2.xml><?xml version="1.0" encoding="utf-8"?>
+<ds:datastoreItem xmlns:ds="http://schemas.openxmlformats.org/officeDocument/2006/customXml" ds:itemID="{978C42C9-F6E6-45CC-92E0-36F7524A8DF4}">
+  <ds:schemaRefs>
+    <ds:schemaRef ds:uri="http://schemas.microsoft.com/office/2006/metadata/properties"/>
+    <ds:schemaRef ds:uri="363f131b-4af0-4a66-9de1-3f50ca42dcc1"/>
+    <ds:schemaRef ds:uri="1e774ceb-dd0d-4965-bc86-3e314450e135"/>
+    <ds:schemaRef ds:uri="http://schemas.microsoft.com/office/infopath/2007/PartnerControls"/>
+  </ds:schemaRefs>
+</ds:datastoreItem>
+</file>
+
+<file path=customXml/itemProps3.xml><?xml version="1.0" encoding="utf-8"?>
+<ds:datastoreItem xmlns:ds="http://schemas.openxmlformats.org/officeDocument/2006/customXml" ds:itemID="{7061A3C1-0CE9-4FBE-A957-202316E798B0}">
+  <ds:schemaRefs>
+    <ds:schemaRef ds:uri="http://schemas.microsoft.com/sharepoint/v3/contenttype/forms"/>
+  </ds:schemaRefs>
+</ds:datastoreItem>
+</file>
+
+<file path=customXml/itemProps4.xml><?xml version="1.0" encoding="utf-8"?>
 <ds:datastoreItem xmlns:ds="http://schemas.openxmlformats.org/officeDocument/2006/customXml" ds:itemID="{EE6A1C0F-1993-4BA0-AC4B-4328F379B4F9}">
   <ds:schemaRefs>
     <ds:schemaRef ds:uri="http://schemas.microsoft.com/sharepoint/events"/>
@@ -4942,26 +5064,6 @@
 </ds:datastoreItem>
 </file>
 
-<file path=customXml/itemProps2.xml><?xml version="1.0" encoding="utf-8"?>
-<ds:datastoreItem xmlns:ds="http://schemas.openxmlformats.org/officeDocument/2006/customXml" ds:itemID="{7061A3C1-0CE9-4FBE-A957-202316E798B0}">
-  <ds:schemaRefs>
-    <ds:schemaRef ds:uri="http://schemas.microsoft.com/sharepoint/v3/contenttype/forms"/>
-  </ds:schemaRefs>
-</ds:datastoreItem>
-</file>
-
-<file path=customXml/itemProps3.xml><?xml version="1.0" encoding="utf-8"?>
-<ds:datastoreItem xmlns:ds="http://schemas.openxmlformats.org/officeDocument/2006/customXml" ds:itemID="{978C42C9-F6E6-45CC-92E0-36F7524A8DF4}">
-  <ds:schemaRefs>
-    <ds:schemaRef ds:uri="http://schemas.microsoft.com/office/2006/metadata/properties"/>
-  </ds:schemaRefs>
-</ds:datastoreItem>
-</file>
-
-<file path=customXml/itemProps4.xml><?xml version="1.0" encoding="utf-8"?>
-<ds:datastoreItem xmlns:ds="http://schemas.openxmlformats.org/officeDocument/2006/customXml" ds:itemID="{E6399034-5E0E-4859-B1BF-AEAF2135B405}"/>
-</file>
-
 <file path=docMetadata/LabelInfo.xml><?xml version="1.0" encoding="utf-8"?>
 <clbl:labelList xmlns:clbl="http://schemas.microsoft.com/office/2020/mipLabelMetadata">
   <clbl:label id="{70663b86-f2b7-4b32-b286-17269b5dc83f}" enabled="1" method="Standard" siteId="{19537222-55d7-4581-84fb-c2da6e835c74}" removed="0"/>

</xml_diff>